<commit_message>
Change account to user
</commit_message>
<xml_diff>
--- a/module4/Hướng dẫn NGINX.docx
+++ b/module4/Hướng dẫn NGINX.docx
@@ -868,6 +868,7 @@
           <w:rFonts w:ascii="Arial" w:hAnsi="Arial" w:cs="Arial"/>
           <w:sz w:val="28"/>
           <w:szCs w:val="28"/>
+          <w:lang w:val="de-DE"/>
         </w:rPr>
       </w:pPr>
     </w:p>
@@ -879,6 +880,7 @@
           <w:b/>
           <w:sz w:val="28"/>
           <w:szCs w:val="28"/>
+          <w:lang w:val="de-DE"/>
         </w:rPr>
       </w:pPr>
       <w:r>
@@ -887,6 +889,57 @@
           <w:b/>
           <w:sz w:val="28"/>
           <w:szCs w:val="28"/>
+          <w:lang w:val="de-DE"/>
+        </w:rPr>
+        <w:t>Kiểm tra</w:t>
+      </w:r>
+    </w:p>
+    <w:p>
+      <w:pPr>
+        <w:spacing w:after="0"/>
+        <w:rPr>
+          <w:rFonts w:ascii="Arial" w:hAnsi="Arial" w:cs="Arial"/>
+          <w:sz w:val="28"/>
+          <w:szCs w:val="28"/>
+        </w:rPr>
+      </w:pPr>
+      <w:r>
+        <w:rPr>
+          <w:rFonts w:ascii="Arial" w:hAnsi="Arial" w:cs="Arial"/>
+          <w:sz w:val="28"/>
+          <w:szCs w:val="28"/>
+        </w:rPr>
+        <w:t>tasklist | findstr nginx</w:t>
+      </w:r>
+    </w:p>
+    <w:p>
+      <w:pPr>
+        <w:spacing w:after="0"/>
+        <w:rPr>
+          <w:rFonts w:ascii="Arial" w:hAnsi="Arial" w:cs="Arial"/>
+          <w:sz w:val="28"/>
+          <w:szCs w:val="28"/>
+        </w:rPr>
+      </w:pPr>
+      <w:bookmarkStart w:id="0" w:name="_GoBack"/>
+      <w:bookmarkEnd w:id="0"/>
+    </w:p>
+    <w:p>
+      <w:pPr>
+        <w:spacing w:after="0"/>
+        <w:rPr>
+          <w:rFonts w:ascii="Arial" w:hAnsi="Arial" w:cs="Arial"/>
+          <w:b/>
+          <w:sz w:val="28"/>
+          <w:szCs w:val="28"/>
+        </w:rPr>
+      </w:pPr>
+      <w:r>
+        <w:rPr>
+          <w:rFonts w:ascii="Arial" w:hAnsi="Arial" w:cs="Arial"/>
+          <w:b/>
+          <w:sz w:val="28"/>
+          <w:szCs w:val="28"/>
         </w:rPr>
         <w:t>Lệnh dừng toàn bộ nginx.exe</w:t>
       </w:r>
@@ -898,68 +951,15 @@
           <w:rFonts w:ascii="Arial" w:hAnsi="Arial" w:cs="Arial"/>
           <w:sz w:val="28"/>
           <w:szCs w:val="28"/>
-          <w:lang w:val="de-DE"/>
-        </w:rPr>
-      </w:pPr>
-      <w:r>
-        <w:rPr>
-          <w:rFonts w:ascii="Arial" w:hAnsi="Arial" w:cs="Arial"/>
-          <w:sz w:val="28"/>
-          <w:szCs w:val="28"/>
-          <w:lang w:val="de-DE"/>
+        </w:rPr>
+      </w:pPr>
+      <w:r>
+        <w:rPr>
+          <w:rFonts w:ascii="Arial" w:hAnsi="Arial" w:cs="Arial"/>
+          <w:sz w:val="28"/>
+          <w:szCs w:val="28"/>
         </w:rPr>
         <w:t>taskkill /F /IM nginx.exe</w:t>
-      </w:r>
-    </w:p>
-    <w:p>
-      <w:pPr>
-        <w:spacing w:after="0"/>
-        <w:rPr>
-          <w:rFonts w:ascii="Arial" w:hAnsi="Arial" w:cs="Arial"/>
-          <w:sz w:val="28"/>
-          <w:szCs w:val="28"/>
-          <w:lang w:val="de-DE"/>
-        </w:rPr>
-      </w:pPr>
-    </w:p>
-    <w:p>
-      <w:pPr>
-        <w:spacing w:after="0"/>
-        <w:rPr>
-          <w:rFonts w:ascii="Arial" w:hAnsi="Arial" w:cs="Arial"/>
-          <w:b/>
-          <w:sz w:val="28"/>
-          <w:szCs w:val="28"/>
-          <w:lang w:val="de-DE"/>
-        </w:rPr>
-      </w:pPr>
-      <w:r>
-        <w:rPr>
-          <w:rFonts w:ascii="Arial" w:hAnsi="Arial" w:cs="Arial"/>
-          <w:b/>
-          <w:sz w:val="28"/>
-          <w:szCs w:val="28"/>
-          <w:lang w:val="de-DE"/>
-        </w:rPr>
-        <w:t>Kiểm tra</w:t>
-      </w:r>
-    </w:p>
-    <w:p>
-      <w:pPr>
-        <w:spacing w:after="0"/>
-        <w:rPr>
-          <w:rFonts w:ascii="Arial" w:hAnsi="Arial" w:cs="Arial"/>
-          <w:sz w:val="28"/>
-          <w:szCs w:val="28"/>
-        </w:rPr>
-      </w:pPr>
-      <w:r>
-        <w:rPr>
-          <w:rFonts w:ascii="Arial" w:hAnsi="Arial" w:cs="Arial"/>
-          <w:sz w:val="28"/>
-          <w:szCs w:val="28"/>
-        </w:rPr>
-        <w:t>tasklist | findstr nginx</w:t>
       </w:r>
     </w:p>
     <w:p>
@@ -1066,8 +1066,6 @@
           </wp:inline>
         </w:drawing>
       </w:r>
-      <w:bookmarkStart w:id="0" w:name="_GoBack"/>
-      <w:bookmarkEnd w:id="0"/>
     </w:p>
     <w:p>
       <w:pPr>

</xml_diff>